<commit_message>
Rework Vishal Mega Mart resume with real P&L tracker + Power BI experience
Kshitiz confirmed real experience in P&L/margin ownership, Power BI, and
cohort/catalogue work when asked about the honest gaps found earlier.
Captured the specifics he gave (counselor-wise P&L tracker, Metabase-to-
Power BI dashboards for Marketing/Sales/Ops, a course recommendation engine)
into experience_bank.md, and swapped the least-relevant group (AI/design
prototypes -- not asked for in this JD) for a new "P&L Ownership &
Cross-Functional Analytics" group using this real material.

Honest re-score: 58% -> 74% (14/19 keywords). Still genuinely missing CAC,
Tableau, and market share -- not fabricated. Cohort-analysis and catalogue
specifics are still an open question (he confirmed the category but hasn't
given the tool/scope yet) -- logged in experience_bank.md's Open Questions.

Co-Authored-By: Claude Sonnet 5 <noreply@anthropic.com>
</commit_message>
<xml_diff>
--- a/resumes/Vishal Mega Mart-Product Manager.docx
+++ b/resumes/Vishal Mega Mart-Product Manager.docx
@@ -213,6 +213,51 @@
           <w:color w:val="2E5AAC"/>
           <w:sz w:val="19"/>
         </w:rPr>
+        <w:t>P&amp;L Ownership &amp; Cross-Functional Analytics</w:t>
+      </w:r>
+    </w:p>
+    <w:p>
+      <w:pPr>
+        <w:pStyle w:val="ListBullet"/>
+        <w:spacing w:after="20" w:before="0" w:line="240" w:lineRule="auto"/>
+      </w:pPr>
+      <w:r>
+        <w:rPr>
+          <w:rFonts w:ascii="Calibri" w:hAnsi="Calibri"/>
+          <w:b w:val="0"/>
+          <w:i w:val="0"/>
+          <w:sz w:val="19"/>
+        </w:rPr>
+        <w:t>Built a counselor-wise P&amp;L tracker as a product-led feature -- computing weekly profitability per sales counselor as Net Revenue − Fixed Cost − Refund Cost − Marketing Cost − Sales Cost -- giving each counselor visibility into the revenue figure needed to be profitable.</w:t>
+      </w:r>
+    </w:p>
+    <w:p>
+      <w:pPr>
+        <w:pStyle w:val="ListBullet"/>
+        <w:spacing w:after="20" w:before="0" w:line="240" w:lineRule="auto"/>
+      </w:pPr>
+      <w:r>
+        <w:rPr>
+          <w:rFonts w:ascii="Calibri" w:hAnsi="Calibri"/>
+          <w:b w:val="0"/>
+          <w:i w:val="0"/>
+          <w:sz w:val="19"/>
+        </w:rPr>
+        <w:t>Built multiple insight-driven Power BI dashboards, sourced from Metabase SQL queries, for Marketing, Sales, and Operations teams, giving cross-functional visibility into business performance.</w:t>
+      </w:r>
+    </w:p>
+    <w:p>
+      <w:pPr>
+        <w:spacing w:before="60" w:after="0"/>
+      </w:pPr>
+      <w:r>
+        <w:rPr>
+          <w:rFonts w:ascii="Calibri" w:hAnsi="Calibri"/>
+          <w:b/>
+          <w:i/>
+          <w:color w:val="2E5AAC"/>
+          <w:sz w:val="19"/>
+        </w:rPr>
         <w:t>Funnel, GTM &amp; Platform (0→1)</w:t>
       </w:r>
     </w:p>
@@ -248,51 +293,6 @@
     </w:p>
     <w:p>
       <w:pPr>
-        <w:spacing w:before="60" w:after="0"/>
-      </w:pPr>
-      <w:r>
-        <w:rPr>
-          <w:rFonts w:ascii="Calibri" w:hAnsi="Calibri"/>
-          <w:b/>
-          <w:i/>
-          <w:color w:val="2E5AAC"/>
-          <w:sz w:val="19"/>
-        </w:rPr>
-        <w:t>AI, Design &amp; Automation</w:t>
-      </w:r>
-    </w:p>
-    <w:p>
-      <w:pPr>
-        <w:pStyle w:val="ListBullet"/>
-        <w:spacing w:after="20" w:before="0" w:line="240" w:lineRule="auto"/>
-      </w:pPr>
-      <w:r>
-        <w:rPr>
-          <w:rFonts w:ascii="Calibri" w:hAnsi="Calibri"/>
-          <w:b w:val="0"/>
-          <w:i w:val="0"/>
-          <w:sz w:val="19"/>
-        </w:rPr>
-        <w:t>Designed prototypes and MVP interfaces for the app, LMS, and CRM in Figma, Adobe Express, and Canva AI, using Gemini, Claude, ChatGPT, and Codex to accelerate iteration and align stakeholders before build.</w:t>
-      </w:r>
-    </w:p>
-    <w:p>
-      <w:pPr>
-        <w:pStyle w:val="ListBullet"/>
-        <w:spacing w:after="20" w:before="0" w:line="240" w:lineRule="auto"/>
-      </w:pPr>
-      <w:r>
-        <w:rPr>
-          <w:rFonts w:ascii="Calibri" w:hAnsi="Calibri"/>
-          <w:b w:val="0"/>
-          <w:i w:val="0"/>
-          <w:sz w:val="19"/>
-        </w:rPr>
-        <w:t>Shipped a production GenAI layer and support chatbot that cut escalations; revamped the Sales CRM (lead navigation, integrated calling, revenue tracking, target-vs-achievement, incentive management), cutting sales-ops workload 80% and automating incentive/enrolment verification to save ₹1.6L/month.</w:t>
-      </w:r>
-    </w:p>
-    <w:p>
-      <w:pPr>
         <w:spacing w:before="100" w:after="40"/>
         <w:pBdr>
           <w:bottom w:val="single" w:sz="6" w:space="1" w:color="2E5AAC"/>
@@ -319,7 +319,7 @@
           <w:i w:val="0"/>
           <w:sz w:val="19"/>
         </w:rPr>
-        <w:t>Product Roadmap &amp; GTM Strategy · Funnel &amp; Conversion Optimization · Revenue &amp; Unit Economics Ownership · Customer Analytics &amp; Retention · A/B Testing &amp; Experimentation · Cross-Functional Leadership (Tech, Design, Marketing, Ops) · Growth &amp; Acquisition · GenAI Product Development · Stakeholder Management</w:t>
+        <w:t>Product Roadmap &amp; GTM Strategy · Funnel &amp; Conversion Optimization · P&amp;L / Margin &amp; Unit Economics Ownership · Power BI &amp; SQL-Driven Analytics · Customer Analytics &amp; Retention · A/B Testing &amp; Experimentation · Cross-Functional Leadership (Tech, Design, Marketing, Sales, Ops) · Growth &amp; Acquisition · Stakeholder Management</w:t>
       </w:r>
     </w:p>
     <w:p>

</xml_diff>